<commit_message>
Corrige build y endurece el cotizador tras revisión
- Fija typescript ~5.9 (TS 7 rompía la resolución del alias @/ en Next 15)
- PDF con fuente Inter (₡ y tildes), fecha dd/mm/aaaa y fecha en hora de Costa Rica
- Validación estricta del token (tamaño, ids únicos, enteros, fecha)
- Modal accesible (foco, Tab, Escape, scroll), cantidad editable, tarjeta HTML válida
- Formato de colones fijo para evitar errores de hidratación
- Documento del plan actualizado

Co-Authored-By: Claude Sonnet 5.5 <noreply@anthropic.com>
Claude-Session: https://claude.ai/code/session_01HBgEKMmkzZCZn4dj6Ug5ey
</commit_message>
<xml_diff>
--- a/docs/Plan-Landing-NFC.docx
+++ b/docs/Plan-Landing-NFC.docx
@@ -888,7 +888,7 @@
           <w:sz w:val="18"/>
           <w:szCs w:val="18"/>
         </w:rPr>
-        <w:t xml:space="preserve">WhatsApp del negocio:  "Hola, quiero cotización de esto ... Ver PDF: &lt;enlace&gt;"</w:t>
+        <w:t xml:space="preserve">WhatsApp del negocio:  "Hola, soy &lt;nombre&gt;. Quiero esta cotización ... Ver PDF: &lt;enlace&gt;"</w:t>
       </w:r>
     </w:p>
     <w:p>
@@ -896,7 +896,15 @@
         <w:spacing w:after="120"/>
       </w:pPr>
       <w:r>
-        <w:t xml:space="preserve">Stack: Next.js 15 (App Router) + React 19 + TypeScript + Tailwind CSS + @react-pdf/renderer, desplegado en Vercel.</w:t>
+        <w:t xml:space="preserve">Stack: Next.js 15 (App Router) + React 19 + TypeScript 5.9 + Tailwind CSS + @react-pdf/renderer, desplegado en Vercel.</w:t>
+      </w:r>
+    </w:p>
+    <w:p>
+      <w:pPr>
+        <w:spacing w:after="120"/>
+      </w:pPr>
+      <w:r>
+        <w:t xml:space="preserve">Importante: Next.js 15 necesita la API de JavaScript de TypeScript 5.x para leer tsconfig.json (alias @/*). TypeScript 7 (compilador nativo) no la incluye y el build falla con «Module not found: Can't resolve '@/...'». Por eso package.json fija typescript ~5.9.</w:t>
       </w:r>
     </w:p>
     <w:p>
@@ -3899,7 +3907,7 @@
           <w:sz w:val="18"/>
           <w:szCs w:val="18"/>
         </w:rPr>
-        <w:t xml:space="preserve">Hola, quiero cotización de esto (COT-261010-AB12):</w:t>
+        <w:t xml:space="preserve">Hola, soy José Peña (Ñandú S.A.). Quiero esta cotización (COT-261010-AB12):</w:t>
       </w:r>
     </w:p>
     <w:p>
@@ -3913,7 +3921,7 @@
           <w:sz w:val="18"/>
           <w:szCs w:val="18"/>
         </w:rPr>
-        <w:t xml:space="preserve">• 3 x Stand NFC</w:t>
+        <w:t xml:space="preserve">• 3 × Stand NFC</w:t>
       </w:r>
     </w:p>
     <w:p>
@@ -3927,7 +3935,7 @@
           <w:sz w:val="18"/>
           <w:szCs w:val="18"/>
         </w:rPr>
-        <w:t xml:space="preserve">• 50 x Tarjeta NFC de PVC</w:t>
+        <w:t xml:space="preserve">• 50 × Tarjeta NFC de PVC</w:t>
       </w:r>
     </w:p>
     <w:p>
@@ -3941,7 +3949,7 @@
           <w:sz w:val="18"/>
           <w:szCs w:val="18"/>
         </w:rPr>
-        <w:t xml:space="preserve">Total: ₡...  (IVA incluido)</w:t>
+        <w:t xml:space="preserve">Total: ₡668.960 (IVA incluido)</w:t>
       </w:r>
     </w:p>
     <w:p>
@@ -4622,7 +4630,7 @@
         </w:numPr>
       </w:pPr>
       <w:r>
-        <w:t xml:space="preserve">Se rechaza el token si hay más de 20 líneas, cantidades fuera de 1–9999, productos desconocidos o nombre vacío.</w:t>
+        <w:t xml:space="preserve">Se rechaza el token si mide más de 14.000 caracteres (se corta antes de decodificar, para evitar abusos), si no es base64url/JSON válido, si no trae líneas o trae más de una línea por producto (máximo 3, sin repetidos), cantidades que no sean enteros de 1 a 9999, productos desconocidos o nombre vacío.</w:t>
       </w:r>
     </w:p>
     <w:p>
@@ -4634,7 +4642,7 @@
         </w:numPr>
       </w:pPr>
       <w:r>
-        <w:t xml:space="preserve">Textos limitados (nombre y empresa 80 caracteres, notas 300) para evitar abusos.</w:t>
+        <w:t xml:space="preserve">El límite de 14.000 cubre el peor caso legítimo del formulario (textos al máximo con tildes); si aun así se pasara, el cotizador avisa que se acorten las notas en lugar de abrir WhatsApp.</w:t>
       </w:r>
     </w:p>
     <w:p>
@@ -4646,7 +4654,31 @@
         </w:numPr>
       </w:pPr>
       <w:r>
-        <w:t xml:space="preserve">Respuesta 400 con mensaje simple si el token es inválido.</w:t>
+        <w:t xml:space="preserve">Fecha y número de cotización se validan; si no son válidos, el servidor usa la fecha de hoy en hora de Costa Rica (UTC−6) y genera un número nuevo.</w:t>
+      </w:r>
+    </w:p>
+    <w:p>
+      <w:pPr>
+        <w:pStyle w:val="ListParagraph"/>
+        <w:numPr>
+          <w:ilvl w:val="0"/>
+          <w:numId w:val="2"/>
+        </w:numPr>
+      </w:pPr>
+      <w:r>
+        <w:t xml:space="preserve">Textos limitados (nombre y empresa 80 caracteres, notas 300) para evitar abusos.</w:t>
+      </w:r>
+    </w:p>
+    <w:p>
+      <w:pPr>
+        <w:pStyle w:val="ListParagraph"/>
+        <w:numPr>
+          <w:ilvl w:val="0"/>
+          <w:numId w:val="2"/>
+        </w:numPr>
+      </w:pPr>
+      <w:r>
+        <w:t xml:space="preserve">Respuesta 400 con mensaje simple si el token es inválido o demasiado largo.</w:t>
       </w:r>
     </w:p>
     <w:p>
@@ -4872,7 +4904,7 @@
           <w:sz w:val="18"/>
           <w:szCs w:val="18"/>
         </w:rPr>
-        <w:t xml:space="preserve">  QuotePdf.tsx        # plantilla del PDF</w:t>
+        <w:t xml:space="preserve">  QuotePdf.tsx        # plantilla del PDF (fuente Inter)</w:t>
       </w:r>
     </w:p>
     <w:p>
@@ -4920,7 +4952,21 @@
     <w:p>
       <w:pPr>
         <w:shd w:fill="F3EFE6" w:val="clear"/>
-        <w:spacing w:after="160"/>
+        <w:spacing w:after="0"/>
+      </w:pPr>
+      <w:r>
+        <w:rPr>
+          <w:rFonts w:ascii="Consolas" w:cs="Consolas" w:eastAsia="Consolas" w:hAnsi="Consolas"/>
+          <w:sz w:val="18"/>
+          <w:szCs w:val="18"/>
+        </w:rPr>
+        <w:t xml:space="preserve">assets/fonts/         # Inter (OFL) para el PDF: incluye ₡, tildes y ñ</w:t>
+      </w:r>
+    </w:p>
+    <w:p>
+      <w:pPr>
+        <w:shd w:fill="F3EFE6" w:val="clear"/>
+        <w:spacing w:after="0"/>
       </w:pPr>
       <w:r>
         <w:rPr>
@@ -4933,6 +4979,20 @@
     </w:p>
     <w:p>
       <w:pPr>
+        <w:shd w:fill="F3EFE6" w:val="clear"/>
+        <w:spacing w:after="160"/>
+      </w:pPr>
+      <w:r>
+        <w:rPr>
+          <w:rFonts w:ascii="Consolas" w:cs="Consolas" w:eastAsia="Consolas" w:hAnsi="Consolas"/>
+          <w:sz w:val="18"/>
+          <w:szCs w:val="18"/>
+        </w:rPr>
+        <w:t xml:space="preserve">next.config.mjs       # react-pdf externo + incluir assets/fonts en /api/pdf</w:t>
+      </w:r>
+    </w:p>
+    <w:p>
+      <w:pPr>
         <w:pStyle w:val="Heading2"/>
       </w:pPr>
       <w:r>
@@ -4992,7 +5052,19 @@
         </w:numPr>
       </w:pPr>
       <w:r>
-        <w:t xml:space="preserve">Modal con role=dialog, cierre con Escape y botón visible.</w:t>
+        <w:t xml:space="preserve">Modal con role=dialog y aria-modal, título asociado, foco dentro del diálogo (Tab no se sale), cierre con Escape, botón visible o clic en el fondo, bloqueo del scroll del fondo y foco devuelto al elemento que lo abrió.</w:t>
+      </w:r>
+    </w:p>
+    <w:p>
+      <w:pPr>
+        <w:pStyle w:val="ListParagraph"/>
+        <w:numPr>
+          <w:ilvl w:val="0"/>
+          <w:numId w:val="2"/>
+        </w:numPr>
+      </w:pPr>
+      <w:r>
+        <w:t xml:space="preserve">Campos de nombre y empresa con etiqueta visible; si falta el nombre se muestra un aviso en lugar de abrir WhatsApp.</w:t>
       </w:r>
     </w:p>
     <w:p>
@@ -5600,7 +5672,7 @@
         </w:numPr>
       </w:pPr>
       <w:r>
-        <w:t xml:space="preserve">Tipografía: una fuente con carácter para titulares y una neutra para texto; se define con la marca (en el PDF se usa Helvetica hasta registrar la fuente real).</w:t>
+        <w:t xml:space="preserve">Tipografía: una fuente con carácter para titulares y una neutra para texto; se define con la marca. En el PDF se usa Inter (registrada desde assets/fonts) porque la Helvetica estándar del PDF no tiene el símbolo ₡; se cambia por la fuente real de la marca cuando exista.</w:t>
       </w:r>
     </w:p>
     <w:p>

</xml_diff>